<commit_message>
object-oriented programming in python
</commit_message>
<xml_diff>
--- a/Docs/Reflections.docx
+++ b/Docs/Reflections.docx
@@ -103,6 +103,20 @@
       </w:r>
       <w:r>
         <w:t xml:space="preserve"> and shadow naming in your function arguments felt pythonic, it feels like I must rename everything because names bleed out to other systems. This felt like a big refactor of my code.</w:t>
+      </w:r>
+    </w:p>
+    <w:p/>
+    <w:p>
+      <w:r>
+        <w:t xml:space="preserve">Lesson 4 - </w:t>
+      </w:r>
+      <w:r>
+        <w:t>Object-Oriented Programming in Python</w:t>
+      </w:r>
+    </w:p>
+    <w:p>
+      <w:r>
+        <w:t>Making classes felt normal same as other languages for the most part. The init dunder function makes since but it feels pythonic. To refactor I would incorporate my session util and maybe make a session manager class that handles the session state outside of the timer but that may be over engineering.</w:t>
       </w:r>
     </w:p>
     <w:sectPr>
@@ -718,6 +732,7 @@
   <w:style w:type="character" w:default="1" w:styleId="DefaultParagraphFont">
     <w:name w:val="Default Paragraph Font"/>
     <w:uiPriority w:val="1"/>
+    <w:semiHidden/>
     <w:unhideWhenUsed/>
   </w:style>
   <w:style w:type="table" w:default="1" w:styleId="TableNormal">

</xml_diff>

<commit_message>
designing objects and state
</commit_message>
<xml_diff>
--- a/Docs/Reflections.docx
+++ b/Docs/Reflections.docx
@@ -116,9 +116,63 @@
     </w:p>
     <w:p>
       <w:r>
-        <w:t>Making classes felt normal same as other languages for the most part. The init dunder function makes since but it feels pythonic. To refactor I would incorporate my session util and maybe make a session manager class that handles the session state outside of the timer but that may be over engineering.</w:t>
+        <w:t xml:space="preserve">Making classes felt normal same as other languages for the most part. The </w:t>
+      </w:r>
+      <w:proofErr w:type="spellStart"/>
+      <w:r>
+        <w:t>init</w:t>
+      </w:r>
+      <w:proofErr w:type="spellEnd"/>
+      <w:r>
+        <w:t xml:space="preserve"> dunder function makes since but it feels pythonic. To refactor I would incorporate my session util and maybe make a session manager class that handles the session state outside of the timer but that may be over engineering.</w:t>
       </w:r>
     </w:p>
+    <w:p/>
+    <w:p/>
+    <w:p>
+      <w:r>
+        <w:lastRenderedPageBreak/>
+        <w:t xml:space="preserve">Lesson </w:t>
+      </w:r>
+      <w:r>
+        <w:t>5</w:t>
+      </w:r>
+      <w:r>
+        <w:t xml:space="preserve"> - </w:t>
+      </w:r>
+      <w:r>
+        <w:t>Designing Objects and State</w:t>
+      </w:r>
+    </w:p>
+    <w:p>
+      <w:r>
+        <w:t xml:space="preserve">The state management felt a bit unnatural at first and took a bit for me to realize how it was updated every step of the way. Making true protected methods is </w:t>
+      </w:r>
+      <w:r>
+        <w:t>different</w:t>
+      </w:r>
+      <w:r>
+        <w:t xml:space="preserve"> in python</w:t>
+      </w:r>
+      <w:r>
+        <w:t xml:space="preserve"> doesn’t prevent, it warns</w:t>
+      </w:r>
+      <w:r>
+        <w:t>.</w:t>
+      </w:r>
+      <w:r>
+        <w:t xml:space="preserve"> Making methods that do one thing felt the same as other languages. Controlling state doesn’t feel as intuitive as other languages I’ve used like typescript. Using self feels repetitive and very pythonic but maybe there’s a better way that I haven’t learned yet. I feel like self should be automatic when you are doing things in scope. I somewhat refactored already by making another class for timer to key the pomodoro timer doing one thing. I made a Session manager</w:t>
+      </w:r>
+      <w:r>
+        <w:t xml:space="preserve"> that handles the schedule and persistent data to track the sessions while Pomodoro timer handles functionality and state transitions.</w:t>
+      </w:r>
+    </w:p>
+    <w:p>
+      <w:r>
+        <w:t>I deleted the session manager because it added unnecessary complexity and refactored my solution</w:t>
+      </w:r>
+    </w:p>
+    <w:p/>
     <w:sectPr>
       <w:pgSz w:w="12240" w:h="15840"/>
       <w:pgMar w:top="1440" w:right="1440" w:bottom="1440" w:left="1440" w:header="720" w:footer="720" w:gutter="0"/>

</xml_diff>

<commit_message>
building the timer engine
</commit_message>
<xml_diff>
--- a/Docs/Reflections.docx
+++ b/Docs/Reflections.docx
@@ -161,13 +161,7 @@
     <w:p/>
     <w:p>
       <w:r>
-        <w:t xml:space="preserve">Lesson </w:t>
-      </w:r>
-      <w:r>
-        <w:t>6</w:t>
-      </w:r>
-      <w:r>
-        <w:t xml:space="preserve"> - </w:t>
+        <w:t xml:space="preserve">Lesson 6 - </w:t>
       </w:r>
       <w:r>
         <w:t>Python Project Structure</w:t>
@@ -179,7 +173,22 @@
       </w:r>
     </w:p>
     <w:p/>
-    <w:p/>
+    <w:p>
+      <w:r>
+        <w:t xml:space="preserve">Lesson 7 - </w:t>
+      </w:r>
+      <w:r>
+        <w:t>Building the Timer Engine</w:t>
+      </w:r>
+    </w:p>
+    <w:p>
+      <w:r>
+        <w:t xml:space="preserve">This was a challenging lesson but familiar with the dev process I had to work out a flow to make sure the logic was correct. Making a custom tick method was easy but understanding control over transition from a tick with the rest of my method took me a bit. This required some refactoring, to make sure the rules were being followed in the flow. </w:t>
+      </w:r>
+      <w:r>
+        <w:t>Testing really help identify issues and validate my logic.</w:t>
+      </w:r>
+    </w:p>
     <w:sectPr>
       <w:pgSz w:w="12240" w:h="15840"/>
       <w:pgMar w:top="1440" w:right="1440" w:bottom="1440" w:left="1440" w:header="720" w:footer="720" w:gutter="0"/>

</xml_diff>

<commit_message>
configuration and data modeling
</commit_message>
<xml_diff>
--- a/Docs/Reflections.docx
+++ b/Docs/Reflections.docx
@@ -186,9 +186,52 @@
         <w:t xml:space="preserve">This was a challenging lesson but familiar with the dev process I had to work out a flow to make sure the logic was correct. Making a custom tick method was easy but understanding control over transition from a tick with the rest of my method took me a bit. This required some refactoring, to make sure the rules were being followed in the flow. </w:t>
       </w:r>
       <w:r>
-        <w:t>Testing really help identify issues and validate my logic.</w:t>
-      </w:r>
-    </w:p>
+        <w:t xml:space="preserve">Testing really </w:t>
+      </w:r>
+      <w:r>
+        <w:t xml:space="preserve">helped </w:t>
+      </w:r>
+      <w:r>
+        <w:t>identify issues and validate my logic.</w:t>
+      </w:r>
+    </w:p>
+    <w:p/>
+    <w:p>
+      <w:r>
+        <w:lastRenderedPageBreak/>
+        <w:t xml:space="preserve">Lesson </w:t>
+      </w:r>
+      <w:r>
+        <w:t>8</w:t>
+      </w:r>
+      <w:r>
+        <w:t xml:space="preserve"> - </w:t>
+      </w:r>
+      <w:r>
+        <w:t>Configuration and Data Modeling</w:t>
+      </w:r>
+    </w:p>
+    <w:p>
+      <w:r>
+        <w:t xml:space="preserve">This was a new concept somewhat, </w:t>
+      </w:r>
+      <w:r>
+        <w:t>I’ve</w:t>
+      </w:r>
+      <w:r>
+        <w:t xml:space="preserve"> worked with docs before to </w:t>
+      </w:r>
+      <w:r>
+        <w:t xml:space="preserve">ingest </w:t>
+      </w:r>
+      <w:r>
+        <w:t>data</w:t>
+      </w:r>
+      <w:r>
+        <w:t xml:space="preserve"> in TypeScript, via a .ts file but this was a bit different learning how to load and check if a file exists. I’ve don’t something like this with txt file in C++ and C# classes in school, but those were writing to a file not reading and loading. So, the modules and packages needed for this are the only things that felt pythonic for this lesson and understanding how to target a path.</w:t>
+      </w:r>
+    </w:p>
+    <w:p/>
     <w:sectPr>
       <w:pgSz w:w="12240" w:h="15840"/>
       <w:pgMar w:top="1440" w:right="1440" w:bottom="1440" w:left="1440" w:header="720" w:footer="720" w:gutter="0"/>

</xml_diff>